<commit_message>
docs: manual de usuario con seccion completa de machotes y demandas (10 subsecciones) + PDFs/DOCX regenerados
</commit_message>
<xml_diff>
--- a/docs/MANUAL_USUARIO.docx
+++ b/docs/MANUAL_USUARIO.docx
@@ -3822,128 +3822,30 @@
         <w:rPr>
           <w:i/>
         </w:rPr>
-        <w:t xml:space="preserve"> (configurado por el administrador) ven estos botones.</w:t>
-      </w:r>
-    </w:p>
-    <w:p>
-      <w:pPr>
-        <w:pStyle w:val="Heading2"/>
-      </w:pPr>
-      <w:r>
-        <w:rPr>
-          <w:color w:val="374151"/>
-        </w:rPr>
-        <w:t>10.1 Generar un documento desde una plantilla (machote)</w:t>
-      </w:r>
-    </w:p>
-    <w:p>
-      <w:pPr>
-        <w:ind w:left="340"/>
-      </w:pPr>
-      <w:r>
-        <w:rPr>
-          <w:b/>
-        </w:rPr>
-        <w:t xml:space="preserve">1.  </w:t>
-      </w:r>
-      <w:r>
-        <w:t xml:space="preserve">Abre el expediente y presiona </w:t>
-      </w:r>
-      <w:r>
-        <w:rPr>
-          <w:b/>
-        </w:rPr>
-        <w:t>Documentos</w:t>
-      </w:r>
-      <w:r>
-        <w:t xml:space="preserve"> (catálogo de machotes).</w:t>
-      </w:r>
-    </w:p>
-    <w:p>
-      <w:pPr>
-        <w:ind w:left="340"/>
-      </w:pPr>
-      <w:r>
-        <w:rPr>
-          <w:b/>
-        </w:rPr>
-        <w:t xml:space="preserve">2.  </w:t>
-      </w:r>
-      <w:r>
-        <w:t>Elige la plantilla adecuada (Demanda Laboral, Carta Finiquito, Convenio, Solicitud, Citatorio, Otro). Las favoritas aparecen primero.</w:t>
-      </w:r>
-    </w:p>
-    <w:p>
-      <w:pPr>
-        <w:ind w:left="340"/>
-      </w:pPr>
-      <w:r>
-        <w:rPr>
-          <w:b/>
-        </w:rPr>
-        <w:t xml:space="preserve">3.  </w:t>
-      </w:r>
-      <w:r>
-        <w:t xml:space="preserve">En </w:t>
-      </w:r>
-      <w:r>
-        <w:rPr>
-          <w:b/>
-        </w:rPr>
-        <w:t>Preparar documento</w:t>
-      </w:r>
-      <w:r>
-        <w:t xml:space="preserve"> verás </w:t>
-      </w:r>
-      <w:r>
-        <w:rPr>
-          <w:b/>
-        </w:rPr>
-        <w:t>qué datos faltan</w:t>
-      </w:r>
-      <w:r>
-        <w:t xml:space="preserve"> (ej. CURP, salario, dirección de la empresa) con su porcentaje de completitud. Haz clic en el enlace de cada campo faltante para </w:t>
-      </w:r>
-      <w:r>
-        <w:rPr>
-          <w:b/>
-        </w:rPr>
-        <w:t>editarlo directamente</w:t>
-      </w:r>
-      <w:r>
-        <w:t>.</w:t>
-      </w:r>
-    </w:p>
-    <w:p>
-      <w:pPr>
-        <w:ind w:left="340"/>
-      </w:pPr>
-      <w:r>
-        <w:rPr>
-          <w:b/>
-        </w:rPr>
-        <w:t xml:space="preserve">4.  </w:t>
-      </w:r>
-      <w:r>
-        <w:t xml:space="preserve">Cuando esté completo, </w:t>
-      </w:r>
-      <w:r>
-        <w:rPr>
-          <w:b/>
-        </w:rPr>
-        <w:t>Generar</w:t>
-      </w:r>
-      <w:r>
-        <w:t xml:space="preserve"> el documento → se abre el </w:t>
-      </w:r>
-      <w:r>
-        <w:rPr>
-          <w:b/>
-        </w:rPr>
-        <w:t>editor</w:t>
-      </w:r>
-      <w:r>
-        <w:t xml:space="preserve"> con el texto ya llenado (los </w:t>
+        <w:t xml:space="preserve"> (configurado por el administrador) ven los botones de Documentos/Demanda. Si no los ves, pídelo al administrador.</w:t>
+      </w:r>
+    </w:p>
+    <w:p>
+      <w:r>
+        <w:t xml:space="preserve">Los </w:t>
+      </w:r>
+      <w:r>
+        <w:rPr>
+          <w:b/>
+        </w:rPr>
+        <w:t>machotes</w:t>
+      </w:r>
+      <w:r>
+        <w:t xml:space="preserve"> son plantillas reutilizables (demanda laboral, carta finiquito, convenio, solicitud, citatorio…) que se llenan automáticamente con los datos del expediente mediante </w:t>
+      </w:r>
+      <w:r>
+        <w:rPr>
+          <w:b/>
+        </w:rPr>
+        <w:t>marcadores</w:t>
+      </w:r>
+      <w:r>
+        <w:t xml:space="preserve"> como </w:t>
       </w:r>
       <w:r>
         <w:rPr>
@@ -3951,164 +3853,10 @@
           <w:sz w:val="18"/>
           <w:shd w:val="clear" w:fill="EEF2FF"/>
         </w:rPr>
-        <w:t>{{ marcadores }}</w:t>
-      </w:r>
-      <w:r>
-        <w:t xml:space="preserve"> se reemplazaron con los datos del caso).</w:t>
-      </w:r>
-    </w:p>
-    <w:p>
-      <w:pPr>
-        <w:ind w:left="340"/>
-      </w:pPr>
-      <w:r>
-        <w:rPr>
-          <w:b/>
-        </w:rPr>
-        <w:t xml:space="preserve">5.  </w:t>
-      </w:r>
-      <w:r>
-        <w:t xml:space="preserve">Revisa, ajusta lo necesario y </w:t>
-      </w:r>
-      <w:r>
-        <w:rPr>
-          <w:b/>
-        </w:rPr>
-        <w:t>Descargar PDF</w:t>
-      </w:r>
-      <w:r>
-        <w:t>.</w:t>
-      </w:r>
-    </w:p>
-    <w:p>
-      <w:pPr>
-        <w:ind w:left="340"/>
-      </w:pPr>
-      <w:r>
-        <w:rPr>
-          <w:b/>
-        </w:rPr>
-        <w:t xml:space="preserve">6.  </w:t>
-      </w:r>
-      <w:r>
-        <w:t xml:space="preserve">Opcional: </w:t>
-      </w:r>
-      <w:r>
-        <w:rPr>
-          <w:b/>
-        </w:rPr>
-        <w:t>Guardar como machote</w:t>
-      </w:r>
-      <w:r>
-        <w:t xml:space="preserve"> para que el equipo reutilice tu versión.</w:t>
-      </w:r>
-    </w:p>
-    <w:p>
-      <w:pPr>
-        <w:pStyle w:val="Heading2"/>
-      </w:pPr>
-      <w:r>
-        <w:rPr>
-          <w:color w:val="374151"/>
-        </w:rPr>
-        <w:t>10.2 Asistente de Demanda (paso a paso)</w:t>
-      </w:r>
-    </w:p>
-    <w:p>
-      <w:pPr>
-        <w:ind w:left="340"/>
-      </w:pPr>
-      <w:r>
-        <w:rPr>
-          <w:b/>
-        </w:rPr>
-        <w:t xml:space="preserve">1.  </w:t>
-      </w:r>
-      <w:r>
-        <w:t xml:space="preserve">En el expediente, presiona </w:t>
-      </w:r>
-      <w:r>
-        <w:rPr>
-          <w:b/>
-        </w:rPr>
-        <w:t>Asistente de Demanda</w:t>
-      </w:r>
-      <w:r>
-        <w:t>.</w:t>
-      </w:r>
-    </w:p>
-    <w:p>
-      <w:pPr>
-        <w:ind w:left="340"/>
-      </w:pPr>
-      <w:r>
-        <w:rPr>
-          <w:b/>
-        </w:rPr>
-        <w:t xml:space="preserve">2.  </w:t>
-      </w:r>
-      <w:r>
-        <w:t>Responde cada sección guiada (actor, demandado, hechos, prestaciones, cálculos).</w:t>
-      </w:r>
-    </w:p>
-    <w:p>
-      <w:pPr>
-        <w:ind w:left="340"/>
-      </w:pPr>
-      <w:r>
-        <w:rPr>
-          <w:b/>
-        </w:rPr>
-        <w:t xml:space="preserve">3.  </w:t>
-      </w:r>
-      <w:r>
-        <w:t xml:space="preserve">Al final, </w:t>
-      </w:r>
-      <w:r>
-        <w:rPr>
-          <w:b/>
-        </w:rPr>
-        <w:t>genera la demanda</w:t>
-      </w:r>
-      <w:r>
-        <w:t xml:space="preserve"> lista para descargar.</w:t>
-      </w:r>
-    </w:p>
-    <w:p>
-      <w:pPr>
-        <w:pStyle w:val="Heading2"/>
-      </w:pPr>
-      <w:r>
-        <w:rPr>
-          <w:color w:val="374151"/>
-        </w:rPr>
-        <w:t>10.3 Generar la demanda directamente</w:t>
-      </w:r>
-    </w:p>
-    <w:p>
-      <w:pPr>
-        <w:pStyle w:val="ListBullet"/>
-      </w:pPr>
-      <w:r>
-        <w:t xml:space="preserve">En el expediente, presiona </w:t>
-      </w:r>
-      <w:r>
-        <w:rPr>
-          <w:b/>
-        </w:rPr>
-        <w:t>Demanda</w:t>
-      </w:r>
-      <w:r>
-        <w:t xml:space="preserve"> → se genera el documento de </w:t>
-      </w:r>
-      <w:r>
-        <w:rPr>
-          <w:b/>
-        </w:rPr>
-        <w:t>Demanda Laboral</w:t>
-      </w:r>
-      <w:r>
-        <w:t xml:space="preserve"> en Word (</w:t>
+        <w:t>{{ nombre_cliente }}</w:t>
+      </w:r>
+      <w:r>
+        <w:t xml:space="preserve">, </w:t>
       </w:r>
       <w:r>
         <w:rPr>
@@ -4116,19 +3864,821 @@
           <w:sz w:val="18"/>
           <w:shd w:val="clear" w:fill="EEF2FF"/>
         </w:rPr>
+        <w:t>{{ empresa }}</w:t>
+      </w:r>
+      <w:r>
+        <w:t xml:space="preserve">, </w:t>
+      </w:r>
+      <w:r>
+        <w:rPr>
+          <w:rFonts w:ascii="Consolas" w:hAnsi="Consolas"/>
+          <w:sz w:val="18"/>
+          <w:shd w:val="clear" w:fill="EEF2FF"/>
+        </w:rPr>
+        <w:t>{{ salario }}</w:t>
+      </w:r>
+      <w:r>
+        <w:t xml:space="preserve">, </w:t>
+      </w:r>
+      <w:r>
+        <w:rPr>
+          <w:rFonts w:ascii="Consolas" w:hAnsi="Consolas"/>
+          <w:sz w:val="18"/>
+          <w:shd w:val="clear" w:fill="EEF2FF"/>
+        </w:rPr>
+        <w:t>{{ curp }}</w:t>
+      </w:r>
+      <w:r>
+        <w:t>, etc.</w:t>
+      </w:r>
+    </w:p>
+    <w:p>
+      <w:pPr>
+        <w:spacing w:after="0"/>
+      </w:pPr>
+    </w:p>
+    <w:p>
+      <w:pPr>
+        <w:pStyle w:val="Heading2"/>
+      </w:pPr>
+      <w:r>
+        <w:rPr>
+          <w:color w:val="374151"/>
+        </w:rPr>
+        <w:t>10.1 El generador de documentos (desde el expediente)</w:t>
+      </w:r>
+    </w:p>
+    <w:p>
+      <w:pPr>
+        <w:ind w:left="340"/>
+      </w:pPr>
+      <w:r>
+        <w:rPr>
+          <w:b/>
+        </w:rPr>
+        <w:t xml:space="preserve">1.  </w:t>
+      </w:r>
+      <w:r>
+        <w:t xml:space="preserve">Abre el expediente y presiona </w:t>
+      </w:r>
+      <w:r>
+        <w:rPr>
+          <w:b/>
+        </w:rPr>
+        <w:t>Documentos</w:t>
+      </w:r>
+      <w:r>
+        <w:t>.</w:t>
+      </w:r>
+    </w:p>
+    <w:p>
+      <w:pPr>
+        <w:ind w:left="340"/>
+      </w:pPr>
+      <w:r>
+        <w:rPr>
+          <w:b/>
+        </w:rPr>
+        <w:t xml:space="preserve">2.  </w:t>
+      </w:r>
+      <w:r>
+        <w:t xml:space="preserve">Arriba verás una </w:t>
+      </w:r>
+      <w:r>
+        <w:rPr>
+          <w:b/>
+        </w:rPr>
+        <w:t>barra de completitud</w:t>
+      </w:r>
+      <w:r>
+        <w:t xml:space="preserve"> con el estado de los datos del expediente (ej. </w:t>
+      </w:r>
+      <w:r>
+        <w:rPr>
+          <w:rFonts w:ascii="Consolas" w:hAnsi="Consolas"/>
+          <w:sz w:val="18"/>
+          <w:shd w:val="clear" w:fill="EEF2FF"/>
+        </w:rPr>
+        <w:t>12/15 completos</w:t>
+      </w:r>
+      <w:r>
+        <w:t xml:space="preserve">) y un enlace para </w:t>
+      </w:r>
+      <w:r>
+        <w:rPr>
+          <w:b/>
+        </w:rPr>
+        <w:t>editar el expediente</w:t>
+      </w:r>
+      <w:r>
+        <w:t xml:space="preserve"> si faltan datos.</w:t>
+      </w:r>
+    </w:p>
+    <w:p>
+      <w:pPr>
+        <w:ind w:left="340"/>
+      </w:pPr>
+      <w:r>
+        <w:rPr>
+          <w:b/>
+        </w:rPr>
+        <w:t xml:space="preserve">3.  </w:t>
+      </w:r>
+      <w:r>
+        <w:t xml:space="preserve">Las plantillas están </w:t>
+      </w:r>
+      <w:r>
+        <w:rPr>
+          <w:b/>
+        </w:rPr>
+        <w:t>agrupadas por categoría</w:t>
+      </w:r>
+      <w:r>
+        <w:t xml:space="preserve"> (Demanda Laboral, Carta Finiquito, Convenio, Solicitud, Citatorio, Otro). Cada tarjeta muestra:</w:t>
+      </w:r>
+    </w:p>
+    <w:p>
+      <w:pPr>
+        <w:pStyle w:val="ListBullet"/>
+      </w:pPr>
+      <w:r>
+        <w:rPr>
+          <w:b/>
+        </w:rPr>
+        <w:t>Ícono y nombre</w:t>
+      </w:r>
+      <w:r>
+        <w:t xml:space="preserve"> de la plantilla, tipo de despido y jurisdicción.</w:t>
+      </w:r>
+    </w:p>
+    <w:p>
+      <w:pPr>
+        <w:pStyle w:val="ListBullet"/>
+      </w:pPr>
+      <w:r>
+        <w:t xml:space="preserve">Los </w:t>
+      </w:r>
+      <w:r>
+        <w:rPr>
+          <w:b/>
+        </w:rPr>
+        <w:t>marcadores disponibles</w:t>
+      </w:r>
+      <w:r>
+        <w:t xml:space="preserve"> que se rellenarán (hasta 5 visibles).</w:t>
+      </w:r>
+    </w:p>
+    <w:p>
+      <w:pPr>
+        <w:ind w:left="340"/>
+      </w:pPr>
+      <w:r>
+        <w:rPr>
+          <w:b/>
+        </w:rPr>
+        <w:t xml:space="preserve">4.  </w:t>
+      </w:r>
+      <w:r>
+        <w:t>Cada plantilla tiene 2 botones:</w:t>
+      </w:r>
+    </w:p>
+    <w:p>
+      <w:pPr>
+        <w:pStyle w:val="ListBullet"/>
+      </w:pPr>
+      <w:r>
+        <w:rPr>
+          <w:b/>
+        </w:rPr>
+        <w:t>Preparar y generar</w:t>
+      </w:r>
+      <w:r>
+        <w:t xml:space="preserve"> → revisas que no falten datos y generas (sección 10.2).</w:t>
+      </w:r>
+    </w:p>
+    <w:p>
+      <w:pPr>
+        <w:pStyle w:val="ListBullet"/>
+      </w:pPr>
+      <w:r>
+        <w:rPr>
+          <w:b/>
+        </w:rPr>
+        <w:t>Editar</w:t>
+      </w:r>
+      <w:r>
+        <w:t xml:space="preserve"> → abre el editor directamente con los datos ya insertados (sección 10.3).</w:t>
+      </w:r>
+    </w:p>
+    <w:p>
+      <w:pPr>
+        <w:spacing w:after="0"/>
+      </w:pPr>
+    </w:p>
+    <w:p>
+      <w:pPr>
+        <w:pStyle w:val="Heading2"/>
+      </w:pPr>
+      <w:r>
+        <w:rPr>
+          <w:color w:val="374151"/>
+        </w:rPr>
+        <w:t>10.2 Preparar el documento (revisar datos antes de generar)</w:t>
+      </w:r>
+    </w:p>
+    <w:p>
+      <w:pPr>
+        <w:ind w:left="340"/>
+      </w:pPr>
+      <w:r>
+        <w:rPr>
+          <w:b/>
+        </w:rPr>
+        <w:t xml:space="preserve">1.  </w:t>
+      </w:r>
+      <w:r>
+        <w:t xml:space="preserve">Presiona </w:t>
+      </w:r>
+      <w:r>
+        <w:rPr>
+          <w:b/>
+        </w:rPr>
+        <w:t>Preparar y generar</w:t>
+      </w:r>
+      <w:r>
+        <w:t xml:space="preserve"> en la plantilla elegida.</w:t>
+      </w:r>
+    </w:p>
+    <w:p>
+      <w:pPr>
+        <w:ind w:left="340"/>
+      </w:pPr>
+      <w:r>
+        <w:rPr>
+          <w:b/>
+        </w:rPr>
+        <w:t xml:space="preserve">2.  </w:t>
+      </w:r>
+      <w:r>
+        <w:rPr>
+          <w:b/>
+        </w:rPr>
+        <w:t>Barra de completitud:</w:t>
+      </w:r>
+      <w:r>
+        <w:t xml:space="preserve"> porcentaje de datos completos (verde ≥80%, ámbar ≥50%, rojo &lt;50%) con mensaje orientativo.</w:t>
+      </w:r>
+    </w:p>
+    <w:p>
+      <w:pPr>
+        <w:ind w:left="340"/>
+      </w:pPr>
+      <w:r>
+        <w:rPr>
+          <w:b/>
+        </w:rPr>
+        <w:t xml:space="preserve">3.  </w:t>
+      </w:r>
+      <w:r>
+        <w:rPr>
+          <w:b/>
+        </w:rPr>
+        <w:t>Checklist por secciones</w:t>
+      </w:r>
+      <w:r>
+        <w:t xml:space="preserve"> (👤 Cliente, 💼 Empleo, 🏢 Empresa, 📋 Expediente): cada campo muestra ✓ (completo) o ! (faltante) con su valor actual y un botón </w:t>
+      </w:r>
+      <w:r>
+        <w:rPr>
+          <w:b/>
+        </w:rPr>
+        <w:t>Editar</w:t>
+      </w:r>
+      <w:r>
+        <w:t xml:space="preserve"> que abre el formulario correspondiente para corregirlo al momento.</w:t>
+      </w:r>
+    </w:p>
+    <w:p>
+      <w:pPr>
+        <w:ind w:left="340"/>
+      </w:pPr>
+      <w:r>
+        <w:rPr>
+          <w:b/>
+        </w:rPr>
+        <w:t xml:space="preserve">4.  </w:t>
+      </w:r>
+      <w:r>
+        <w:rPr>
+          <w:b/>
+        </w:rPr>
+        <w:t>Resumen de cálculos</w:t>
+      </w:r>
+      <w:r>
+        <w:t xml:space="preserve"> (columna derecha): aguinaldo, vacaciones, prima vacacional, prima de antigüedad (con aviso de tope), indemnización y </w:t>
+      </w:r>
+      <w:r>
+        <w:rPr>
+          <w:b/>
+        </w:rPr>
+        <w:t>TOTAL</w:t>
+      </w:r>
+      <w:r>
+        <w:t xml:space="preserve">, calculados con los datos del expediente. Enlace a </w:t>
+      </w:r>
+      <w:r>
+        <w:rPr>
+          <w:b/>
+        </w:rPr>
+        <w:t>Ver cálculo completo →</w:t>
+      </w:r>
+      <w:r>
+        <w:t>.</w:t>
+      </w:r>
+    </w:p>
+    <w:p>
+      <w:pPr>
+        <w:ind w:left="340"/>
+      </w:pPr>
+      <w:r>
+        <w:rPr>
+          <w:b/>
+        </w:rPr>
+        <w:t xml:space="preserve">5.  </w:t>
+      </w:r>
+      <w:r>
+        <w:rPr>
+          <w:b/>
+        </w:rPr>
+        <w:t>Marcadores disponibles:</w:t>
+      </w:r>
+      <w:r>
+        <w:t xml:space="preserve"> chips con los </w:t>
+      </w:r>
+      <w:r>
+        <w:rPr>
+          <w:rFonts w:ascii="Consolas" w:hAnsi="Consolas"/>
+          <w:sz w:val="18"/>
+          <w:shd w:val="clear" w:fill="EEF2FF"/>
+        </w:rPr>
+        <w:t>{{ marcadores }}</w:t>
+      </w:r>
+      <w:r>
+        <w:t xml:space="preserve"> que se inyectarán.</w:t>
+      </w:r>
+    </w:p>
+    <w:p>
+      <w:pPr>
+        <w:ind w:left="340"/>
+      </w:pPr>
+      <w:r>
+        <w:rPr>
+          <w:b/>
+        </w:rPr>
+        <w:t xml:space="preserve">6.  </w:t>
+      </w:r>
+      <w:r>
+        <w:rPr>
+          <w:b/>
+        </w:rPr>
+        <w:t>Vista previa de valores inyectados:</w:t>
+      </w:r>
+      <w:r>
+        <w:t xml:space="preserve"> los valores que se insertarán; los que aparecen en </w:t>
+      </w:r>
+      <w:r>
+        <w:rPr>
+          <w:b/>
+        </w:rPr>
+        <w:t>rojo</w:t>
+      </w:r>
+      <w:r>
+        <w:t xml:space="preserve"> (ej. </w:t>
+      </w:r>
+      <w:r>
+        <w:rPr>
+          <w:rFonts w:ascii="Consolas" w:hAnsi="Consolas"/>
+          <w:sz w:val="18"/>
+          <w:shd w:val="clear" w:fill="EEF2FF"/>
+        </w:rPr>
+        <w:t>[CURP]</w:t>
+      </w:r>
+      <w:r>
+        <w:t xml:space="preserve">, </w:t>
+      </w:r>
+      <w:r>
+        <w:rPr>
+          <w:rFonts w:ascii="Consolas" w:hAnsi="Consolas"/>
+          <w:sz w:val="18"/>
+          <w:shd w:val="clear" w:fill="EEF2FF"/>
+        </w:rPr>
+        <w:t>[MONTO]</w:t>
+      </w:r>
+      <w:r>
+        <w:t>) indican datos faltantes.</w:t>
+      </w:r>
+    </w:p>
+    <w:p>
+      <w:pPr>
+        <w:ind w:left="340"/>
+      </w:pPr>
+      <w:r>
+        <w:rPr>
+          <w:b/>
+        </w:rPr>
+        <w:t xml:space="preserve">7.  </w:t>
+      </w:r>
+      <w:r>
+        <w:t xml:space="preserve">Presiona </w:t>
+      </w:r>
+      <w:r>
+        <w:rPr>
+          <w:b/>
+        </w:rPr>
+        <w:t>✅ Generar documento</w:t>
+      </w:r>
+      <w:r>
+        <w:t xml:space="preserve"> (si faltan datos, el botón cambia a </w:t>
+      </w:r>
+      <w:r>
+        <w:rPr>
+          <w:b/>
+        </w:rPr>
+        <w:t>⚠️ Generar de todas formas</w:t>
+      </w:r>
+      <w:r>
+        <w:t>) → se abre el editor con el texto ya llenado.</w:t>
+      </w:r>
+    </w:p>
+    <w:p>
+      <w:pPr>
+        <w:spacing w:after="0"/>
+      </w:pPr>
+    </w:p>
+    <w:p>
+      <w:pPr>
+        <w:pStyle w:val="Heading2"/>
+      </w:pPr>
+      <w:r>
+        <w:rPr>
+          <w:color w:val="374151"/>
+        </w:rPr>
+        <w:t>10.3 Editor del documento</w:t>
+      </w:r>
+    </w:p>
+    <w:p>
+      <w:pPr>
+        <w:ind w:left="340"/>
+      </w:pPr>
+      <w:r>
+        <w:rPr>
+          <w:b/>
+        </w:rPr>
+        <w:t xml:space="preserve">1.  </w:t>
+      </w:r>
+      <w:r>
+        <w:t xml:space="preserve">El documento se abre en un </w:t>
+      </w:r>
+      <w:r>
+        <w:rPr>
+          <w:b/>
+        </w:rPr>
+        <w:t>editor de texto enriquecido</w:t>
+      </w:r>
+      <w:r>
+        <w:t xml:space="preserve"> (Quill) con los datos del caso </w:t>
+      </w:r>
+      <w:r>
+        <w:rPr>
+          <w:b/>
+        </w:rPr>
+        <w:t>ya insertados</w:t>
+      </w:r>
+      <w:r>
+        <w:t xml:space="preserve"> — puedes editar cualquier parte libremente.</w:t>
+      </w:r>
+    </w:p>
+    <w:p>
+      <w:pPr>
+        <w:ind w:left="340"/>
+      </w:pPr>
+      <w:r>
+        <w:rPr>
+          <w:b/>
+        </w:rPr>
+        <w:t xml:space="preserve">2.  </w:t>
+      </w:r>
+      <w:r>
+        <w:t>Botones:</w:t>
+      </w:r>
+    </w:p>
+    <w:p>
+      <w:pPr>
+        <w:pStyle w:val="ListBullet"/>
+      </w:pPr>
+      <w:r>
+        <w:rPr>
+          <w:b/>
+        </w:rPr>
+        <w:t>👁️ Vista previa</w:t>
+      </w:r>
+      <w:r>
+        <w:t xml:space="preserve"> — ve el documento limpio (modal) antes de descargar.</w:t>
+      </w:r>
+    </w:p>
+    <w:p>
+      <w:pPr>
+        <w:pStyle w:val="ListBullet"/>
+      </w:pPr>
+      <w:r>
+        <w:rPr>
+          <w:b/>
+        </w:rPr>
+        <w:t>📄 Descargar Word</w:t>
+      </w:r>
+      <w:r>
+        <w:t xml:space="preserve"> — genera el </w:t>
+      </w:r>
+      <w:r>
+        <w:rPr>
+          <w:rFonts w:ascii="Consolas" w:hAnsi="Consolas"/>
+          <w:sz w:val="18"/>
+          <w:shd w:val="clear" w:fill="EEF2FF"/>
+        </w:rPr>
         <w:t>.docx</w:t>
       </w:r>
       <w:r>
-        <w:t xml:space="preserve">) con todos los datos y cálculos integrados → </w:t>
-      </w:r>
-      <w:r>
-        <w:rPr>
-          <w:b/>
-        </w:rPr>
-        <w:t>Descargar</w:t>
+        <w:t xml:space="preserve"> listo para imprimir/firmar (también con </w:t>
+      </w:r>
+      <w:r>
+        <w:rPr>
+          <w:rFonts w:ascii="Consolas" w:hAnsi="Consolas"/>
+          <w:sz w:val="18"/>
+          <w:shd w:val="clear" w:fill="EEF2FF"/>
+        </w:rPr>
+        <w:t>Ctrl+Shift+D</w:t>
+      </w:r>
+      <w:r>
+        <w:t>).</w:t>
+      </w:r>
+    </w:p>
+    <w:p>
+      <w:pPr>
+        <w:ind w:left="340"/>
+      </w:pPr>
+      <w:r>
+        <w:rPr>
+          <w:b/>
+        </w:rPr>
+        <w:t xml:space="preserve">3.  </w:t>
+      </w:r>
+      <w:r>
+        <w:rPr>
+          <w:b/>
+        </w:rPr>
+        <w:t>Auto-guardado:</w:t>
+      </w:r>
+      <w:r>
+        <w:t xml:space="preserve"> cada 30 segundos se guarda un </w:t>
+      </w:r>
+      <w:r>
+        <w:rPr>
+          <w:b/>
+        </w:rPr>
+        <w:t>borrador local</w:t>
+      </w:r>
+      <w:r>
+        <w:t xml:space="preserve"> en tu navegador; si cierras sin querer, al volver se restaura. Ojo: si cambias de equipo, el borrador no viaja contigo.</w:t>
+      </w:r>
+    </w:p>
+    <w:p>
+      <w:pPr>
+        <w:ind w:left="340"/>
+      </w:pPr>
+      <w:r>
+        <w:rPr>
+          <w:b/>
+        </w:rPr>
+        <w:t xml:space="preserve">4.  </w:t>
+      </w:r>
+      <w:r>
+        <w:t xml:space="preserve">Al final de la página verás </w:t>
+      </w:r>
+      <w:r>
+        <w:rPr>
+          <w:b/>
+        </w:rPr>
+        <w:t>otras plantillas similares</w:t>
+      </w:r>
+      <w:r>
+        <w:t xml:space="preserve"> para cambiar rápido.</w:t>
+      </w:r>
+    </w:p>
+    <w:p>
+      <w:pPr>
+        <w:ind w:left="340"/>
+      </w:pPr>
+      <w:r>
+        <w:rPr>
+          <w:b/>
+        </w:rPr>
+        <w:t xml:space="preserve">5.  </w:t>
+      </w:r>
+      <w:r>
+        <w:t>⚠️ Descarga siempre el documento; los cambios no editados se pierden al cerrar.</w:t>
+      </w:r>
+    </w:p>
+    <w:p>
+      <w:pPr>
+        <w:spacing w:after="0"/>
+      </w:pPr>
+    </w:p>
+    <w:p>
+      <w:pPr>
+        <w:pStyle w:val="Heading2"/>
+      </w:pPr>
+      <w:r>
+        <w:rPr>
+          <w:color w:val="374151"/>
+        </w:rPr>
+        <w:t>10.4 Catálogo de machotes (gestionar plantillas)</w:t>
+      </w:r>
+    </w:p>
+    <w:p>
+      <w:r>
+        <w:t xml:space="preserve">Entra a </w:t>
+      </w:r>
+      <w:r>
+        <w:rPr>
+          <w:b/>
+        </w:rPr>
+        <w:t>Machotes → Catálogo</w:t>
+      </w:r>
+      <w:r>
+        <w:t xml:space="preserve"> (menú o desde el botón </w:t>
+      </w:r>
+      <w:r>
+        <w:rPr>
+          <w:b/>
+        </w:rPr>
+        <w:t>Documentos</w:t>
+      </w:r>
+      <w:r>
+        <w:t xml:space="preserve"> del expediente):</w:t>
+      </w:r>
+    </w:p>
+    <w:p>
+      <w:pPr>
+        <w:ind w:left="340"/>
+      </w:pPr>
+      <w:r>
+        <w:rPr>
+          <w:b/>
+        </w:rPr>
+        <w:t xml:space="preserve">1.  </w:t>
+      </w:r>
+      <w:r>
+        <w:rPr>
+          <w:b/>
+        </w:rPr>
+        <w:t>Buscar y filtrar:</w:t>
+      </w:r>
+      <w:r>
+        <w:t xml:space="preserve"> busca por nombre/descripción/archivo y filtra por </w:t>
+      </w:r>
+      <w:r>
+        <w:rPr>
+          <w:b/>
+        </w:rPr>
+        <w:t>categoría</w:t>
+      </w:r>
+      <w:r>
+        <w:t xml:space="preserve"> (muestra el conteo por categoría). Botón </w:t>
+      </w:r>
+      <w:r>
+        <w:rPr>
+          <w:b/>
+        </w:rPr>
+        <w:t>Limpiar filtros</w:t>
       </w:r>
       <w:r>
         <w:t>.</w:t>
+      </w:r>
+    </w:p>
+    <w:p>
+      <w:pPr>
+        <w:ind w:left="340"/>
+      </w:pPr>
+      <w:r>
+        <w:rPr>
+          <w:b/>
+        </w:rPr>
+        <w:t xml:space="preserve">2.  </w:t>
+      </w:r>
+      <w:r>
+        <w:t xml:space="preserve">Cada plantilla (agrupada por categoría) muestra su ícono, nombre, descripción, archivo de origen, y etiquetas de </w:t>
+      </w:r>
+      <w:r>
+        <w:rPr>
+          <w:b/>
+        </w:rPr>
+        <w:t>★ Favorito</w:t>
+      </w:r>
+      <w:r>
+        <w:t>, tipo de despido y jurisdicción.</w:t>
+      </w:r>
+    </w:p>
+    <w:p>
+      <w:pPr>
+        <w:ind w:left="340"/>
+      </w:pPr>
+      <w:r>
+        <w:rPr>
+          <w:b/>
+        </w:rPr>
+        <w:t xml:space="preserve">3.  </w:t>
+      </w:r>
+      <w:r>
+        <w:t>Acciones por plantilla:</w:t>
+      </w:r>
+    </w:p>
+    <w:p>
+      <w:pPr>
+        <w:pStyle w:val="ListBullet"/>
+      </w:pPr>
+      <w:r>
+        <w:rPr>
+          <w:b/>
+        </w:rPr>
+        <w:t>👁️ Vista previa</w:t>
+      </w:r>
+      <w:r>
+        <w:t xml:space="preserve"> — despliega el contenido HTML de la plantilla en pantalla.</w:t>
+      </w:r>
+    </w:p>
+    <w:p>
+      <w:pPr>
+        <w:pStyle w:val="ListBullet"/>
+      </w:pPr>
+      <w:r>
+        <w:rPr>
+          <w:b/>
+        </w:rPr>
+        <w:t>✏️ Editar</w:t>
+      </w:r>
+      <w:r>
+        <w:t xml:space="preserve"> — abre el editor de plantilla (sección 10.5).</w:t>
+      </w:r>
+    </w:p>
+    <w:p>
+      <w:pPr>
+        <w:pStyle w:val="ListBullet"/>
+      </w:pPr>
+      <w:r>
+        <w:rPr>
+          <w:b/>
+        </w:rPr>
+        <w:t>Renombrar</w:t>
+      </w:r>
+      <w:r>
+        <w:t xml:space="preserve"> — cambia el nombre sin abrir el editor (modal).</w:t>
+      </w:r>
+    </w:p>
+    <w:p>
+      <w:pPr>
+        <w:pStyle w:val="ListBullet"/>
+      </w:pPr>
+      <w:r>
+        <w:rPr>
+          <w:b/>
+        </w:rPr>
+        <w:t>🗑️ Eliminar</w:t>
+      </w:r>
+      <w:r>
+        <w:t xml:space="preserve"> — borra la plantilla (pide confirmación, no se puede deshacer).</w:t>
+      </w:r>
+    </w:p>
+    <w:p>
+      <w:pPr>
+        <w:ind w:left="340"/>
+      </w:pPr>
+      <w:r>
+        <w:rPr>
+          <w:b/>
+        </w:rPr>
+        <w:t xml:space="preserve">4.  </w:t>
+      </w:r>
+      <w:r>
+        <w:t xml:space="preserve">Botón </w:t>
+      </w:r>
+      <w:r>
+        <w:rPr>
+          <w:b/>
+        </w:rPr>
+        <w:t>📤 Subir nueva demanda (Word)</w:t>
+      </w:r>
+      <w:r>
+        <w:t xml:space="preserve"> en la parte superior → sección 10.6.</w:t>
       </w:r>
     </w:p>
     <w:p>
@@ -4140,20 +4690,1082 @@
         <w:rPr>
           <w:i/>
         </w:rPr>
-        <w:t xml:space="preserve">💡 El administrador gestiona las plantillas desde </w:t>
+        <w:t xml:space="preserve">💡 Los </w:t>
       </w:r>
       <w:r>
         <w:rPr>
           <w:b/>
           <w:i/>
         </w:rPr>
-        <w:t>Machotes → Catálogo/Importar</w:t>
+        <w:t>machotes favoritos</w:t>
       </w:r>
       <w:r>
         <w:rPr>
           <w:i/>
         </w:rPr>
-        <w:t>. Los archivos Word existentes se pueden importar como plantillas.</w:t>
+        <w:t xml:space="preserve"> aparecen primero en el editor de demanda. Marca la estrella desde el editor o el admin.</w:t>
+      </w:r>
+    </w:p>
+    <w:p>
+      <w:pPr>
+        <w:spacing w:after="0"/>
+      </w:pPr>
+    </w:p>
+    <w:p>
+      <w:pPr>
+        <w:pStyle w:val="Heading2"/>
+      </w:pPr>
+      <w:r>
+        <w:rPr>
+          <w:color w:val="374151"/>
+        </w:rPr>
+        <w:t>10.5 Editar una plantilla (machote)</w:t>
+      </w:r>
+    </w:p>
+    <w:p>
+      <w:pPr>
+        <w:ind w:left="340"/>
+      </w:pPr>
+      <w:r>
+        <w:rPr>
+          <w:b/>
+        </w:rPr>
+        <w:t xml:space="preserve">1.  </w:t>
+      </w:r>
+      <w:r>
+        <w:t xml:space="preserve">Desde el catálogo, presiona </w:t>
+      </w:r>
+      <w:r>
+        <w:rPr>
+          <w:b/>
+        </w:rPr>
+        <w:t>Editar</w:t>
+      </w:r>
+      <w:r>
+        <w:t xml:space="preserve"> en la plantilla.</w:t>
+      </w:r>
+    </w:p>
+    <w:p>
+      <w:pPr>
+        <w:ind w:left="340"/>
+      </w:pPr>
+      <w:r>
+        <w:rPr>
+          <w:b/>
+        </w:rPr>
+        <w:t xml:space="preserve">2.  </w:t>
+      </w:r>
+      <w:r>
+        <w:rPr>
+          <w:b/>
+        </w:rPr>
+        <w:t>Datos de la plantilla:</w:t>
+      </w:r>
+      <w:r>
+        <w:t xml:space="preserve"> nombre, descripción, </w:t>
+      </w:r>
+      <w:r>
+        <w:rPr>
+          <w:b/>
+        </w:rPr>
+        <w:t>categoría</w:t>
+      </w:r>
+      <w:r>
+        <w:t xml:space="preserve">, </w:t>
+      </w:r>
+      <w:r>
+        <w:rPr>
+          <w:b/>
+        </w:rPr>
+        <w:t>tipo de despido</w:t>
+      </w:r>
+      <w:r>
+        <w:t xml:space="preserve">, </w:t>
+      </w:r>
+      <w:r>
+        <w:rPr>
+          <w:b/>
+        </w:rPr>
+        <w:t>jurisdicción</w:t>
+      </w:r>
+      <w:r>
+        <w:t xml:space="preserve"> (Federal / Estatal BC / Ambas) e </w:t>
+      </w:r>
+      <w:r>
+        <w:rPr>
+          <w:b/>
+        </w:rPr>
+        <w:t>ícono</w:t>
+      </w:r>
+      <w:r>
+        <w:t xml:space="preserve"> (emoji).</w:t>
+      </w:r>
+    </w:p>
+    <w:p>
+      <w:pPr>
+        <w:ind w:left="340"/>
+      </w:pPr>
+      <w:r>
+        <w:rPr>
+          <w:b/>
+        </w:rPr>
+        <w:t xml:space="preserve">3.  </w:t>
+      </w:r>
+      <w:r>
+        <w:rPr>
+          <w:b/>
+        </w:rPr>
+        <w:t>Contenido:</w:t>
+      </w:r>
+      <w:r>
+        <w:t xml:space="preserve"> editor de texto enriquecido; escribe los </w:t>
+      </w:r>
+      <w:r>
+        <w:rPr>
+          <w:b/>
+        </w:rPr>
+        <w:t>marcadores</w:t>
+      </w:r>
+      <w:r>
+        <w:t xml:space="preserve"> </w:t>
+      </w:r>
+      <w:r>
+        <w:rPr>
+          <w:rFonts w:ascii="Consolas" w:hAnsi="Consolas"/>
+          <w:sz w:val="18"/>
+          <w:shd w:val="clear" w:fill="EEF2FF"/>
+        </w:rPr>
+        <w:t>{{ variable }}</w:t>
+      </w:r>
+      <w:r>
+        <w:t xml:space="preserve"> donde quieras que se inserten datos del expediente.</w:t>
+      </w:r>
+    </w:p>
+    <w:p>
+      <w:pPr>
+        <w:ind w:left="340"/>
+      </w:pPr>
+      <w:r>
+        <w:rPr>
+          <w:b/>
+        </w:rPr>
+        <w:t xml:space="preserve">4.  </w:t>
+      </w:r>
+      <w:r>
+        <w:rPr>
+          <w:b/>
+        </w:rPr>
+        <w:t>💾 Guardar cambios</w:t>
+      </w:r>
+      <w:r>
+        <w:t xml:space="preserve"> (</w:t>
+      </w:r>
+      <w:r>
+        <w:rPr>
+          <w:rFonts w:ascii="Consolas" w:hAnsi="Consolas"/>
+          <w:sz w:val="18"/>
+          <w:shd w:val="clear" w:fill="EEF2FF"/>
+        </w:rPr>
+        <w:t>Ctrl+Shift+S</w:t>
+      </w:r>
+      <w:r>
+        <w:t>). Los cambios aplican a todos los expedientes futuros.</w:t>
+      </w:r>
+    </w:p>
+    <w:p>
+      <w:pPr>
+        <w:ind w:left="340"/>
+      </w:pPr>
+      <w:r>
+        <w:rPr>
+          <w:b/>
+        </w:rPr>
+        <w:t xml:space="preserve">5.  </w:t>
+      </w:r>
+      <w:r>
+        <w:t xml:space="preserve">En la parte inferior hay un bloque </w:t>
+      </w:r>
+      <w:r>
+        <w:rPr>
+          <w:b/>
+        </w:rPr>
+        <w:t>🗑️ Eliminar plantilla</w:t>
+      </w:r>
+      <w:r>
+        <w:t xml:space="preserve"> (con confirmación).</w:t>
+      </w:r>
+    </w:p>
+    <w:p>
+      <w:pPr>
+        <w:spacing w:after="0"/>
+      </w:pPr>
+    </w:p>
+    <w:p>
+      <w:pPr>
+        <w:pStyle w:val="Heading2"/>
+      </w:pPr>
+      <w:r>
+        <w:rPr>
+          <w:color w:val="374151"/>
+        </w:rPr>
+        <w:t>10.6 Subir una demanda Word como plantilla (importar .docx)</w:t>
+      </w:r>
+    </w:p>
+    <w:p>
+      <w:pPr>
+        <w:ind w:left="340"/>
+      </w:pPr>
+      <w:r>
+        <w:rPr>
+          <w:b/>
+        </w:rPr>
+        <w:t xml:space="preserve">1.  </w:t>
+      </w:r>
+      <w:r>
+        <w:t xml:space="preserve">Desde el </w:t>
+      </w:r>
+      <w:r>
+        <w:rPr>
+          <w:b/>
+        </w:rPr>
+        <w:t>Catálogo de Machotes</w:t>
+      </w:r>
+      <w:r>
+        <w:t xml:space="preserve">, presiona </w:t>
+      </w:r>
+      <w:r>
+        <w:rPr>
+          <w:b/>
+        </w:rPr>
+        <w:t>📤 Subir nueva demanda (Word)</w:t>
+      </w:r>
+      <w:r>
+        <w:t>.</w:t>
+      </w:r>
+    </w:p>
+    <w:p>
+      <w:pPr>
+        <w:ind w:left="340"/>
+      </w:pPr>
+      <w:r>
+        <w:rPr>
+          <w:b/>
+        </w:rPr>
+        <w:t xml:space="preserve">2.  </w:t>
+      </w:r>
+      <w:r>
+        <w:t xml:space="preserve">Selecciona un archivo </w:t>
+      </w:r>
+      <w:r>
+        <w:rPr>
+          <w:b/>
+        </w:rPr>
+        <w:t>`.docx`</w:t>
+      </w:r>
+      <w:r>
+        <w:t xml:space="preserve"> (demanda, finiquito, convenio, solicitud o citatorio ya redactados).</w:t>
+      </w:r>
+    </w:p>
+    <w:p>
+      <w:pPr>
+        <w:ind w:left="340"/>
+      </w:pPr>
+      <w:r>
+        <w:rPr>
+          <w:b/>
+        </w:rPr>
+        <w:t xml:space="preserve">3.  </w:t>
+      </w:r>
+      <w:r>
+        <w:t xml:space="preserve">El sistema lo </w:t>
+      </w:r>
+      <w:r>
+        <w:rPr>
+          <w:b/>
+        </w:rPr>
+        <w:t>convierte en plantilla reutilizable</w:t>
+      </w:r>
+      <w:r>
+        <w:t xml:space="preserve">: los datos específicos (fechas, salarios, CURP, RFC, teléfonos) se reemplazan automáticamente por </w:t>
+      </w:r>
+      <w:r>
+        <w:rPr>
+          <w:b/>
+        </w:rPr>
+        <w:t>marcadores</w:t>
+      </w:r>
+      <w:r>
+        <w:t xml:space="preserve"> (</w:t>
+      </w:r>
+      <w:r>
+        <w:rPr>
+          <w:rFonts w:ascii="Consolas" w:hAnsi="Consolas"/>
+          <w:sz w:val="18"/>
+          <w:shd w:val="clear" w:fill="EEF2FF"/>
+        </w:rPr>
+        <w:t>{{ fecha }}</w:t>
+      </w:r>
+      <w:r>
+        <w:t xml:space="preserve">, </w:t>
+      </w:r>
+      <w:r>
+        <w:rPr>
+          <w:rFonts w:ascii="Consolas" w:hAnsi="Consolas"/>
+          <w:sz w:val="18"/>
+          <w:shd w:val="clear" w:fill="EEF2FF"/>
+        </w:rPr>
+        <w:t>{{ salario }}</w:t>
+      </w:r>
+      <w:r>
+        <w:t xml:space="preserve">, </w:t>
+      </w:r>
+      <w:r>
+        <w:rPr>
+          <w:rFonts w:ascii="Consolas" w:hAnsi="Consolas"/>
+          <w:sz w:val="18"/>
+          <w:shd w:val="clear" w:fill="EEF2FF"/>
+        </w:rPr>
+        <w:t>{{ curp }}</w:t>
+      </w:r>
+      <w:r>
+        <w:t>…).</w:t>
+      </w:r>
+    </w:p>
+    <w:p>
+      <w:pPr>
+        <w:ind w:left="340"/>
+      </w:pPr>
+      <w:r>
+        <w:rPr>
+          <w:b/>
+        </w:rPr>
+        <w:t xml:space="preserve">4.  </w:t>
+      </w:r>
+      <w:r>
+        <w:rPr>
+          <w:b/>
+        </w:rPr>
+        <w:t>Clasificación automática por el nombre del archivo:</w:t>
+      </w:r>
+      <w:r>
+        <w:t xml:space="preserve"> si el nombre contiene </w:t>
+      </w:r>
+      <w:r>
+        <w:rPr>
+          <w:rFonts w:ascii="Consolas" w:hAnsi="Consolas"/>
+          <w:sz w:val="18"/>
+          <w:shd w:val="clear" w:fill="EEF2FF"/>
+        </w:rPr>
+        <w:t>demanda</w:t>
+      </w:r>
+      <w:r>
+        <w:t xml:space="preserve"> → Demanda Laboral; </w:t>
+      </w:r>
+      <w:r>
+        <w:rPr>
+          <w:rFonts w:ascii="Consolas" w:hAnsi="Consolas"/>
+          <w:sz w:val="18"/>
+          <w:shd w:val="clear" w:fill="EEF2FF"/>
+        </w:rPr>
+        <w:t>finiquito</w:t>
+      </w:r>
+      <w:r>
+        <w:t xml:space="preserve"> → Carta Finiquito; </w:t>
+      </w:r>
+      <w:r>
+        <w:rPr>
+          <w:rFonts w:ascii="Consolas" w:hAnsi="Consolas"/>
+          <w:sz w:val="18"/>
+          <w:shd w:val="clear" w:fill="EEF2FF"/>
+        </w:rPr>
+        <w:t>convenio</w:t>
+      </w:r>
+      <w:r>
+        <w:t xml:space="preserve"> → Convenio; </w:t>
+      </w:r>
+      <w:r>
+        <w:rPr>
+          <w:rFonts w:ascii="Consolas" w:hAnsi="Consolas"/>
+          <w:sz w:val="18"/>
+          <w:shd w:val="clear" w:fill="EEF2FF"/>
+        </w:rPr>
+        <w:t>solicitud</w:t>
+      </w:r>
+      <w:r>
+        <w:t xml:space="preserve"> → Solicitud; </w:t>
+      </w:r>
+      <w:r>
+        <w:rPr>
+          <w:rFonts w:ascii="Consolas" w:hAnsi="Consolas"/>
+          <w:sz w:val="18"/>
+          <w:shd w:val="clear" w:fill="EEF2FF"/>
+        </w:rPr>
+        <w:t>citatorio</w:t>
+      </w:r>
+      <w:r>
+        <w:t xml:space="preserve"> → Citatorio; cualquier otro → Otro.</w:t>
+      </w:r>
+    </w:p>
+    <w:p>
+      <w:pPr>
+        <w:ind w:left="340"/>
+      </w:pPr>
+      <w:r>
+        <w:rPr>
+          <w:b/>
+        </w:rPr>
+        <w:t xml:space="preserve">5.  </w:t>
+      </w:r>
+      <w:r>
+        <w:t xml:space="preserve">Si el archivo ya se importó antes, se muestra un aviso y </w:t>
+      </w:r>
+      <w:r>
+        <w:rPr>
+          <w:b/>
+        </w:rPr>
+        <w:t>no se duplica</w:t>
+      </w:r>
+      <w:r>
+        <w:t>.</w:t>
+      </w:r>
+    </w:p>
+    <w:p>
+      <w:pPr>
+        <w:ind w:left="340"/>
+      </w:pPr>
+      <w:r>
+        <w:rPr>
+          <w:b/>
+        </w:rPr>
+        <w:t xml:space="preserve">6.  </w:t>
+      </w:r>
+      <w:r>
+        <w:t>La plantilla queda disponible en el catálogo y en el generador de documentos.</w:t>
+      </w:r>
+    </w:p>
+    <w:p>
+      <w:pPr>
+        <w:spacing w:after="0"/>
+      </w:pPr>
+    </w:p>
+    <w:p>
+      <w:pPr>
+        <w:pStyle w:val="Heading2"/>
+      </w:pPr>
+      <w:r>
+        <w:rPr>
+          <w:color w:val="374151"/>
+        </w:rPr>
+        <w:t>10.7 Asistente de Demanda (paso a paso)</w:t>
+      </w:r>
+    </w:p>
+    <w:p>
+      <w:r>
+        <w:t xml:space="preserve">Guía de </w:t>
+      </w:r>
+      <w:r>
+        <w:rPr>
+          <w:b/>
+        </w:rPr>
+        <w:t>4 pasos</w:t>
+      </w:r>
+      <w:r>
+        <w:t xml:space="preserve"> para no omitir ningún dato. En el expediente, presiona </w:t>
+      </w:r>
+      <w:r>
+        <w:rPr>
+          <w:b/>
+        </w:rPr>
+        <w:t>Asistente de Demanda</w:t>
+      </w:r>
+      <w:r>
+        <w:t>:</w:t>
+      </w:r>
+    </w:p>
+    <w:p>
+      <w:pPr>
+        <w:pStyle w:val="ListBullet"/>
+      </w:pPr>
+      <w:r>
+        <w:rPr>
+          <w:b/>
+        </w:rPr>
+        <w:t>Paso 1 — Datos del actor (trabajador):</w:t>
+      </w:r>
+      <w:r>
+        <w:t xml:space="preserve"> nombre (aparecerá arriba y en la firma), CURP, RFC, teléfono, WhatsApp, email, fecha de nacimiento, género, cómo supo del despacho y oficina. (Los obligatorios están marcados con </w:t>
+      </w:r>
+      <w:r>
+        <w:rPr>
+          <w:rFonts w:ascii="Consolas" w:hAnsi="Consolas"/>
+          <w:sz w:val="18"/>
+          <w:shd w:val="clear" w:fill="EEF2FF"/>
+        </w:rPr>
+        <w:t>*</w:t>
+      </w:r>
+      <w:r>
+        <w:t>.)</w:t>
+      </w:r>
+    </w:p>
+    <w:p>
+      <w:pPr>
+        <w:pStyle w:val="ListBullet"/>
+      </w:pPr>
+      <w:r>
+        <w:rPr>
+          <w:b/>
+        </w:rPr>
+        <w:t>Paso 2 — Datos de empleo:</w:t>
+      </w:r>
+      <w:r>
+        <w:t xml:space="preserve"> puesto, </w:t>
+      </w:r>
+      <w:r>
+        <w:rPr>
+          <w:b/>
+        </w:rPr>
+        <w:t>salario</w:t>
+      </w:r>
+      <w:r>
+        <w:t xml:space="preserve"> (necesario para los cálculos), periodo de pago, horas semanales, jornada, </w:t>
+      </w:r>
+      <w:r>
+        <w:rPr>
+          <w:b/>
+        </w:rPr>
+        <w:t>fecha de ingreso</w:t>
+      </w:r>
+      <w:r>
+        <w:t xml:space="preserve"> y </w:t>
+      </w:r>
+      <w:r>
+        <w:rPr>
+          <w:b/>
+        </w:rPr>
+        <w:t>fecha de salida</w:t>
+      </w:r>
+      <w:r>
+        <w:t>.</w:t>
+      </w:r>
+    </w:p>
+    <w:p>
+      <w:pPr>
+        <w:pStyle w:val="ListBullet"/>
+      </w:pPr>
+      <w:r>
+        <w:rPr>
+          <w:b/>
+        </w:rPr>
+        <w:t>Paso 3 — Datos de la empresa/patrón:</w:t>
+      </w:r>
+      <w:r>
+        <w:t xml:space="preserve"> usa el </w:t>
+      </w:r>
+      <w:r>
+        <w:rPr>
+          <w:b/>
+        </w:rPr>
+        <w:t>buscador de empresas</w:t>
+      </w:r>
+      <w:r>
+        <w:t xml:space="preserve"> del catálogo para autocompletar, o captura nombre, razón social, actividad, tipo de persona (física/moral), teléfono, domicilio y referencias.</w:t>
+      </w:r>
+    </w:p>
+    <w:p>
+      <w:pPr>
+        <w:pStyle w:val="ListBullet"/>
+      </w:pPr>
+      <w:r>
+        <w:rPr>
+          <w:b/>
+        </w:rPr>
+        <w:t>Paso 4 — Revisión final:</w:t>
+      </w:r>
+    </w:p>
+    <w:p>
+      <w:pPr>
+        <w:pStyle w:val="ListBullet"/>
+      </w:pPr>
+      <w:r>
+        <w:rPr>
+          <w:b/>
+        </w:rPr>
+        <w:t>🔒 Datos críticos</w:t>
+      </w:r>
+      <w:r>
+        <w:t xml:space="preserve"> — lista de lo que falta (si algo aparece en rojo "FALTA", regresa a completarlo).</w:t>
+      </w:r>
+    </w:p>
+    <w:p>
+      <w:pPr>
+        <w:pStyle w:val="ListBullet"/>
+      </w:pPr>
+      <w:r>
+        <w:rPr>
+          <w:b/>
+        </w:rPr>
+        <w:t>⚖️ Tipo de despido</w:t>
+      </w:r>
+      <w:r>
+        <w:t xml:space="preserve"> — selecciónalo; </w:t>
+      </w:r>
+      <w:r>
+        <w:rPr>
+          <w:b/>
+        </w:rPr>
+        <w:t>los cálculos se ajustan automáticamente</w:t>
+      </w:r>
+      <w:r>
+        <w:t>.</w:t>
+      </w:r>
+    </w:p>
+    <w:p>
+      <w:pPr>
+        <w:pStyle w:val="ListBullet"/>
+      </w:pPr>
+      <w:r>
+        <w:rPr>
+          <w:b/>
+        </w:rPr>
+        <w:t>🧮 Cálculo automático</w:t>
+      </w:r>
+      <w:r>
+        <w:t xml:space="preserve"> — tabla con aguinaldo, vacaciones, prima vacacional, prima de antigüedad, indemnización y </w:t>
+      </w:r>
+      <w:r>
+        <w:rPr>
+          <w:b/>
+        </w:rPr>
+        <w:t>TOTAL</w:t>
+      </w:r>
+      <w:r>
+        <w:t>.</w:t>
+      </w:r>
+    </w:p>
+    <w:p>
+      <w:pPr>
+        <w:pStyle w:val="ListBullet"/>
+      </w:pPr>
+      <w:r>
+        <w:rPr>
+          <w:b/>
+        </w:rPr>
+        <w:t>✍️ Verificación de la firma</w:t>
+      </w:r>
+      <w:r>
+        <w:t xml:space="preserve"> — confirma que el nombre del actor aparezca arriba y abajo (evita que quede el nombre de una demanda anterior).</w:t>
+      </w:r>
+    </w:p>
+    <w:p>
+      <w:r>
+        <w:t xml:space="preserve">Al terminar, presiona </w:t>
+      </w:r>
+      <w:r>
+        <w:rPr>
+          <w:b/>
+        </w:rPr>
+        <w:t>✨ Generar demanda y editar</w:t>
+      </w:r>
+      <w:r>
+        <w:t xml:space="preserve"> → se abre el editor con todo insertado. Puedes volver atrás en cualquier paso con </w:t>
+      </w:r>
+      <w:r>
+        <w:rPr>
+          <w:b/>
+        </w:rPr>
+        <w:t>Anterior</w:t>
+      </w:r>
+      <w:r>
+        <w:t>.</w:t>
+      </w:r>
+    </w:p>
+    <w:p>
+      <w:pPr>
+        <w:spacing w:after="0"/>
+      </w:pPr>
+    </w:p>
+    <w:p>
+      <w:pPr>
+        <w:pStyle w:val="Heading2"/>
+      </w:pPr>
+      <w:r>
+        <w:rPr>
+          <w:color w:val="374151"/>
+        </w:rPr>
+        <w:t>10.8 Editor de Demanda</w:t>
+      </w:r>
+    </w:p>
+    <w:p>
+      <w:pPr>
+        <w:ind w:left="340"/>
+      </w:pPr>
+      <w:r>
+        <w:rPr>
+          <w:b/>
+        </w:rPr>
+        <w:t xml:space="preserve">1.  </w:t>
+      </w:r>
+      <w:r>
+        <w:rPr>
+          <w:b/>
+        </w:rPr>
+        <w:t>Selector de plantillas por tipo de despido</w:t>
+      </w:r>
+      <w:r>
+        <w:t xml:space="preserve"> (Injustificado, Justificado, Voluntario, Rescisión, Otro) — la recomendada para cada tipo trae la etiqueta </w:t>
+      </w:r>
+      <w:r>
+        <w:rPr>
+          <w:b/>
+        </w:rPr>
+        <w:t>RECOMENDADO</w:t>
+      </w:r>
+      <w:r>
+        <w:t xml:space="preserve">. Cambia con un clic (o </w:t>
+      </w:r>
+      <w:r>
+        <w:rPr>
+          <w:rFonts w:ascii="Consolas" w:hAnsi="Consolas"/>
+          <w:sz w:val="18"/>
+          <w:shd w:val="clear" w:fill="EEF2FF"/>
+        </w:rPr>
+        <w:t>Ctrl+Shift+1..5</w:t>
+      </w:r>
+      <w:r>
+        <w:t>).</w:t>
+      </w:r>
+    </w:p>
+    <w:p>
+      <w:pPr>
+        <w:ind w:left="340"/>
+      </w:pPr>
+      <w:r>
+        <w:rPr>
+          <w:b/>
+        </w:rPr>
+        <w:t xml:space="preserve">2.  </w:t>
+      </w:r>
+      <w:r>
+        <w:rPr>
+          <w:b/>
+        </w:rPr>
+        <w:t>Machotes de casos reales</w:t>
+      </w:r>
+      <w:r>
+        <w:t xml:space="preserve"> (si existen): plantillas importadas de </w:t>
+      </w:r>
+      <w:r>
+        <w:rPr>
+          <w:rFonts w:ascii="Consolas" w:hAnsi="Consolas"/>
+          <w:sz w:val="18"/>
+          <w:shd w:val="clear" w:fill="EEF2FF"/>
+        </w:rPr>
+        <w:t>.docx</w:t>
+      </w:r>
+      <w:r>
+        <w:t xml:space="preserve"> de casos anteriores, con </w:t>
+      </w:r>
+      <w:r>
+        <w:rPr>
+          <w:b/>
+        </w:rPr>
+        <w:t>estrella para marcarlas como favoritas</w:t>
+      </w:r>
+      <w:r>
+        <w:t>. Al cargarlas, los marcadores se reemplazan con los datos del expediente actual.</w:t>
+      </w:r>
+    </w:p>
+    <w:p>
+      <w:pPr>
+        <w:ind w:left="340"/>
+      </w:pPr>
+      <w:r>
+        <w:rPr>
+          <w:b/>
+        </w:rPr>
+        <w:t xml:space="preserve">3.  </w:t>
+      </w:r>
+      <w:r>
+        <w:t xml:space="preserve">⚠️ Si al cliente le </w:t>
+      </w:r>
+      <w:r>
+        <w:rPr>
+          <w:b/>
+        </w:rPr>
+        <w:t>faltan datos críticos</w:t>
+      </w:r>
+      <w:r>
+        <w:t xml:space="preserve">, verás una alerta roja y la descarga queda </w:t>
+      </w:r>
+      <w:r>
+        <w:rPr>
+          <w:b/>
+        </w:rPr>
+        <w:t>bloqueada</w:t>
+      </w:r>
+      <w:r>
+        <w:t xml:space="preserve"> hasta completarlos (enlace directo al asistente).</w:t>
+      </w:r>
+    </w:p>
+    <w:p>
+      <w:pPr>
+        <w:ind w:left="340"/>
+      </w:pPr>
+      <w:r>
+        <w:rPr>
+          <w:b/>
+        </w:rPr>
+        <w:t xml:space="preserve">4.  </w:t>
+      </w:r>
+      <w:r>
+        <w:t xml:space="preserve">Botones: </w:t>
+      </w:r>
+      <w:r>
+        <w:rPr>
+          <w:b/>
+        </w:rPr>
+        <w:t>👁️ Vista previa</w:t>
+      </w:r>
+      <w:r>
+        <w:t xml:space="preserve">, </w:t>
+      </w:r>
+      <w:r>
+        <w:rPr>
+          <w:b/>
+        </w:rPr>
+        <w:t>📑 Guardar como machote</w:t>
+      </w:r>
+      <w:r>
+        <w:t xml:space="preserve"> (sección 10.9) y </w:t>
+      </w:r>
+      <w:r>
+        <w:rPr>
+          <w:b/>
+        </w:rPr>
+        <w:t>📄 Descargar Word</w:t>
+      </w:r>
+      <w:r>
+        <w:t xml:space="preserve"> (</w:t>
+      </w:r>
+      <w:r>
+        <w:rPr>
+          <w:rFonts w:ascii="Consolas" w:hAnsi="Consolas"/>
+          <w:sz w:val="18"/>
+          <w:shd w:val="clear" w:fill="EEF2FF"/>
+        </w:rPr>
+        <w:t>Ctrl+Shift+D</w:t>
+      </w:r>
+      <w:r>
+        <w:t>).</w:t>
+      </w:r>
+    </w:p>
+    <w:p>
+      <w:pPr>
+        <w:ind w:left="340"/>
+      </w:pPr>
+      <w:r>
+        <w:rPr>
+          <w:b/>
+        </w:rPr>
+        <w:t xml:space="preserve">5.  </w:t>
+      </w:r>
+      <w:r>
+        <w:rPr>
+          <w:b/>
+        </w:rPr>
+        <w:t>Auto-guardado</w:t>
+      </w:r>
+      <w:r>
+        <w:t xml:space="preserve"> del borrador local cada 30 segundos (se restaura al volver).</w:t>
+      </w:r>
+    </w:p>
+    <w:p>
+      <w:pPr>
+        <w:ind w:left="340"/>
+      </w:pPr>
+      <w:r>
+        <w:rPr>
+          <w:b/>
+        </w:rPr>
+        <w:t xml:space="preserve">6.  </w:t>
+      </w:r>
+      <w:r>
+        <w:t>Al cambiar de plantilla o machote, si ya editaste contenido te pedirá confirmación (para que no pierdas tu trabajo).</w:t>
+      </w:r>
+    </w:p>
+    <w:p>
+      <w:pPr>
+        <w:spacing w:after="0"/>
+      </w:pPr>
+    </w:p>
+    <w:p>
+      <w:pPr>
+        <w:pStyle w:val="Heading2"/>
+      </w:pPr>
+      <w:r>
+        <w:rPr>
+          <w:color w:val="374151"/>
+        </w:rPr>
+        <w:t>10.9 Guardar como machote (reutilizar tu versión)</w:t>
+      </w:r>
+    </w:p>
+    <w:p>
+      <w:pPr>
+        <w:ind w:left="340"/>
+      </w:pPr>
+      <w:r>
+        <w:rPr>
+          <w:b/>
+        </w:rPr>
+        <w:t xml:space="preserve">1.  </w:t>
+      </w:r>
+      <w:r>
+        <w:t xml:space="preserve">En el editor de demanda (o de documento), presiona </w:t>
+      </w:r>
+      <w:r>
+        <w:rPr>
+          <w:b/>
+        </w:rPr>
+        <w:t>📑 Guardar como machote</w:t>
+      </w:r>
+      <w:r>
+        <w:t>.</w:t>
+      </w:r>
+    </w:p>
+    <w:p>
+      <w:pPr>
+        <w:ind w:left="340"/>
+      </w:pPr>
+      <w:r>
+        <w:rPr>
+          <w:b/>
+        </w:rPr>
+        <w:t xml:space="preserve">2.  </w:t>
+      </w:r>
+      <w:r>
+        <w:t xml:space="preserve">Escribe un </w:t>
+      </w:r>
+      <w:r>
+        <w:rPr>
+          <w:b/>
+        </w:rPr>
+        <w:t>nombre</w:t>
+      </w:r>
+      <w:r>
+        <w:t xml:space="preserve"> descriptivo (ej. "Demanda por despido injustificado con vacaciones vencidas").</w:t>
+      </w:r>
+    </w:p>
+    <w:p>
+      <w:pPr>
+        <w:ind w:left="340"/>
+      </w:pPr>
+      <w:r>
+        <w:rPr>
+          <w:b/>
+        </w:rPr>
+        <w:t xml:space="preserve">3.  </w:t>
+      </w:r>
+      <w:r>
+        <w:t xml:space="preserve">El sistema </w:t>
+      </w:r>
+      <w:r>
+        <w:rPr>
+          <w:b/>
+        </w:rPr>
+        <w:t>convierte los datos del cliente en marcadores</w:t>
+      </w:r>
+      <w:r>
+        <w:t xml:space="preserve"> automáticamente, para que la plantilla sirva en otros casos.</w:t>
+      </w:r>
+    </w:p>
+    <w:p>
+      <w:pPr>
+        <w:ind w:left="340"/>
+      </w:pPr>
+      <w:r>
+        <w:rPr>
+          <w:b/>
+        </w:rPr>
+        <w:t xml:space="preserve">4.  </w:t>
+      </w:r>
+      <w:r>
+        <w:rPr>
+          <w:b/>
+        </w:rPr>
+        <w:t>Guardar machote</w:t>
+      </w:r>
+      <w:r>
+        <w:t xml:space="preserve"> → queda en el catálogo disponible para todo el equipo.</w:t>
+      </w:r>
+    </w:p>
+    <w:p>
+      <w:pPr>
+        <w:spacing w:after="0"/>
+      </w:pPr>
+    </w:p>
+    <w:p>
+      <w:pPr>
+        <w:pStyle w:val="Heading2"/>
+      </w:pPr>
+      <w:r>
+        <w:rPr>
+          <w:color w:val="374151"/>
+        </w:rPr>
+        <w:t>10.10 Generar la demanda directamente</w:t>
+      </w:r>
+    </w:p>
+    <w:p>
+      <w:pPr>
+        <w:pStyle w:val="ListBullet"/>
+      </w:pPr>
+      <w:r>
+        <w:t xml:space="preserve">En el expediente, presiona </w:t>
+      </w:r>
+      <w:r>
+        <w:rPr>
+          <w:b/>
+        </w:rPr>
+        <w:t>Demanda</w:t>
+      </w:r>
+      <w:r>
+        <w:t xml:space="preserve"> → se abre el editor con la demanda ya generada (plantilla según el tipo de despido, datos y cálculos integrados).</w:t>
+      </w:r>
+    </w:p>
+    <w:p>
+      <w:pPr>
+        <w:spacing w:before="80" w:after="80"/>
+        <w:ind w:left="340"/>
+      </w:pPr>
+      <w:r>
+        <w:rPr>
+          <w:i/>
+        </w:rPr>
+        <w:t xml:space="preserve">💡 El administrador también puede crear plantillas desde el </w:t>
+      </w:r>
+      <w:r>
+        <w:rPr>
+          <w:b/>
+          <w:i/>
+        </w:rPr>
+        <w:t>admin de Django</w:t>
+      </w:r>
+      <w:r>
+        <w:rPr>
+          <w:i/>
+        </w:rPr>
+        <w:t xml:space="preserve"> (Machotes → Añadir) o con el comando </w:t>
+      </w:r>
+      <w:r>
+        <w:rPr>
+          <w:i/>
+        </w:rPr>
+        <w:t>importar_machotes</w:t>
+      </w:r>
+      <w:r>
+        <w:rPr>
+          <w:i/>
+        </w:rPr>
+        <w:t xml:space="preserve"> (convierte un lote de archivos .docx).</w:t>
       </w:r>
     </w:p>
     <w:p>

</xml_diff>